<commit_message>
Bind live bidirectional camera video and audio stream feed in Telehealth Video Room
</commit_message>
<xml_diff>
--- a/22424715_PulseTriage/Project_Documentation.docx
+++ b/22424715_PulseTriage/Project_Documentation.docx
@@ -546,7 +546,7 @@
               <w:jc w:val="left"/>
             </w:pPr>
             <w:r>
-              <w:t xml:space="preserve">Complete IEEE 830-1998 Software Requirements Specification — 61 identified requirements with priorities, verification status and a full traceability matrix.</w:t>
+              <w:t xml:space="preserve">Complete IEEE 830-1998 Software Requirements Specification — 71 functional and 18 non-functional requirements (plus 16 external-interface requirements), each with a MoSCoW priority, a verification status and a full traceability matrix.</w:t>
             </w:r>
           </w:p>
         </w:tc>
@@ -575,7 +575,7 @@
               <w:jc w:val="left"/>
             </w:pPr>
             <w:r>
-              <w:t xml:space="preserve">68 test cases, executed results, performance measurements, security probe evidence and the defect log.</w:t>
+              <w:t xml:space="preserve">72 test cases, executed results, performance measurements, security probe evidence and the defect log.</w:t>
             </w:r>
           </w:p>
         </w:tc>
@@ -1308,7 +1308,7 @@
               <w:t xml:space="preserve"> </w:t>
             </w:r>
             <w:r>
-              <w:t xml:space="preserve">— 61 requirements, MoSCoW prioritised, scope frozen at hour 6</w:t>
+              <w:t xml:space="preserve">— 89 functional and non-functional requirements, MoSCoW prioritised, scope frozen at hour 6</w:t>
             </w:r>
           </w:p>
         </w:tc>
@@ -1608,7 +1608,7 @@
               <w:t xml:space="preserve"> </w:t>
             </w:r>
             <w:r>
-              <w:t xml:space="preserve">— 68 cases, 7 defects raised including 3 Critical</w:t>
+              <w:t xml:space="preserve">— 72 cases, 8 defects raised including 3 Critical</w:t>
             </w:r>
           </w:p>
         </w:tc>
@@ -3277,6 +3277,14 @@
         <w:t xml:space="preserve">implementation and was the mechanism by which the effort estimate in §7 was converted into a scope decision.</w:t>
       </w:r>
     </w:p>
+    <w:p>
+      <w:pPr>
+        <w:pStyle w:val="BodyText"/>
+      </w:pPr>
+      <w:r>
+        <w:t xml:space="preserve">Counts below cover the 71 functional and 18 non-functional requirements. The 16 external-interface requirements (UI, API, COM) are prioritised in the SRS but excluded from this table to avoid double-counting.</w:t>
+      </w:r>
+    </w:p>
     <w:tbl>
       <w:tblPr>
         <w:tblStyle w:val="Table"/>
@@ -3379,7 +3387,7 @@
               <w:jc w:val="center"/>
             </w:pPr>
             <w:r>
-              <w:t xml:space="preserve">38</w:t>
+              <w:t xml:space="preserve">58</w:t>
             </w:r>
           </w:p>
         </w:tc>
@@ -3391,7 +3399,7 @@
               <w:jc w:val="center"/>
             </w:pPr>
             <w:r>
-              <w:t xml:space="preserve">34</w:t>
+              <w:t xml:space="preserve">54</w:t>
             </w:r>
           </w:p>
         </w:tc>
@@ -3433,7 +3441,7 @@
               <w:jc w:val="center"/>
             </w:pPr>
             <w:r>
-              <w:t xml:space="preserve">12</w:t>
+              <w:t xml:space="preserve">17</w:t>
             </w:r>
           </w:p>
         </w:tc>
@@ -3445,7 +3453,7 @@
               <w:jc w:val="center"/>
             </w:pPr>
             <w:r>
-              <w:t xml:space="preserve">5</w:t>
+              <w:t xml:space="preserve">8</w:t>
             </w:r>
           </w:p>
         </w:tc>
@@ -3487,7 +3495,7 @@
               <w:jc w:val="center"/>
             </w:pPr>
             <w:r>
-              <w:t xml:space="preserve">8</w:t>
+              <w:t xml:space="preserve">11</w:t>
             </w:r>
           </w:p>
         </w:tc>
@@ -3499,7 +3507,7 @@
               <w:jc w:val="center"/>
             </w:pPr>
             <w:r>
-              <w:t xml:space="preserve">6</w:t>
+              <w:t xml:space="preserve">9</w:t>
             </w:r>
           </w:p>
         </w:tc>
@@ -3554,6 +3562,56 @@
             </w:pPr>
             <w:r>
               <w:t xml:space="preserve">0</w:t>
+            </w:r>
+          </w:p>
+        </w:tc>
+      </w:tr>
+      <w:tr>
+        <w:tc>
+          <w:tcPr/>
+          <w:p>
+            <w:pPr>
+              <w:pStyle w:val="Compact"/>
+            </w:pPr>
+          </w:p>
+        </w:tc>
+        <w:tc>
+          <w:tcPr/>
+          <w:p>
+            <w:pPr>
+              <w:pStyle w:val="Compact"/>
+            </w:pPr>
+          </w:p>
+        </w:tc>
+        <w:tc>
+          <w:tcPr/>
+          <w:p>
+            <w:pPr>
+              <w:pStyle w:val="Compact"/>
+              <w:jc w:val="center"/>
+            </w:pPr>
+            <w:r>
+              <w:rPr>
+                <w:b/>
+                <w:bCs/>
+              </w:rPr>
+              <w:t xml:space="preserve">89</w:t>
+            </w:r>
+          </w:p>
+        </w:tc>
+        <w:tc>
+          <w:tcPr/>
+          <w:p>
+            <w:pPr>
+              <w:pStyle w:val="Compact"/>
+              <w:jc w:val="center"/>
+            </w:pPr>
+            <w:r>
+              <w:rPr>
+                <w:b/>
+                <w:bCs/>
+              </w:rPr>
+              <w:t xml:space="preserve">71</w:t>
             </w:r>
           </w:p>
         </w:tc>
@@ -15617,7 +15675,7 @@
               <w:jc w:val="center"/>
             </w:pPr>
             <w:r>
-              <w:t xml:space="preserve">10</w:t>
+              <w:t xml:space="preserve">3</w:t>
             </w:r>
           </w:p>
         </w:tc>
@@ -15635,19 +15693,25 @@
               </w:rPr>
               <w:t xml:space="preserve">All within budget</w:t>
             </w:r>
-          </w:p>
-        </w:tc>
-      </w:tr>
-      <w:tr>
-        <w:tc>
-          <w:tcPr/>
-          <w:p>
-            <w:pPr>
-              <w:pStyle w:val="Compact"/>
-              <w:jc w:val="left"/>
-            </w:pPr>
-            <w:r>
-              <w:t xml:space="preserve">Security probes</w:t>
+            <w:r>
+              <w:t xml:space="preserve"> </w:t>
+            </w:r>
+            <w:r>
+              <w:t xml:space="preserve">(14 measurements)</w:t>
+            </w:r>
+          </w:p>
+        </w:tc>
+      </w:tr>
+      <w:tr>
+        <w:tc>
+          <w:tcPr/>
+          <w:p>
+            <w:pPr>
+              <w:pStyle w:val="Compact"/>
+              <w:jc w:val="left"/>
+            </w:pPr>
+            <w:r>
+              <w:t xml:space="preserve">Security</w:t>
             </w:r>
           </w:p>
         </w:tc>
@@ -15659,7 +15723,7 @@
               <w:jc w:val="center"/>
             </w:pPr>
             <w:r>
-              <w:t xml:space="preserve">9</w:t>
+              <w:t xml:space="preserve">14</w:t>
             </w:r>
           </w:p>
         </w:tc>
@@ -15675,7 +15739,7 @@
                 <w:b/>
                 <w:bCs/>
               </w:rPr>
-              <w:t xml:space="preserve">4 pass, 5 fail</w:t>
+              <w:t xml:space="preserve">9 pass, 5 fail</w:t>
             </w:r>
           </w:p>
         </w:tc>
@@ -15803,6 +15867,48 @@
               </w:rPr>
               <w:t xml:space="preserve">5 pass</w:t>
             </w:r>
+          </w:p>
+        </w:tc>
+      </w:tr>
+      <w:tr>
+        <w:tc>
+          <w:tcPr/>
+          <w:p>
+            <w:pPr>
+              <w:pStyle w:val="Compact"/>
+              <w:jc w:val="left"/>
+            </w:pPr>
+            <w:r>
+              <w:rPr>
+                <w:b/>
+                <w:bCs/>
+              </w:rPr>
+              <w:t xml:space="preserve">Total</w:t>
+            </w:r>
+          </w:p>
+        </w:tc>
+        <w:tc>
+          <w:tcPr/>
+          <w:p>
+            <w:pPr>
+              <w:pStyle w:val="Compact"/>
+              <w:jc w:val="center"/>
+            </w:pPr>
+            <w:r>
+              <w:rPr>
+                <w:b/>
+                <w:bCs/>
+              </w:rPr>
+              <w:t xml:space="preserve">72</w:t>
+            </w:r>
+          </w:p>
+        </w:tc>
+        <w:tc>
+          <w:tcPr/>
+          <w:p>
+            <w:pPr>
+              <w:pStyle w:val="Compact"/>
+            </w:pPr>
           </w:p>
         </w:tc>
       </w:tr>
@@ -15909,7 +16015,7 @@
           <w:b/>
           <w:bCs/>
         </w:rPr>
-        <w:t xml:space="preserve">Seven defects raised, three closed.</w:t>
+        <w:t xml:space="preserve">Eight defects raised, three closed.</w:t>
       </w:r>
       <w:r>
         <w:t xml:space="preserve"> </w:t>
@@ -17017,7 +17123,7 @@
               <w:jc w:val="left"/>
             </w:pPr>
             <w:r>
-              <w:t xml:space="preserve">TD-11, TD-12, TD-10, TD-15</w:t>
+              <w:t xml:space="preserve">TD-11, TD-12, TD-10 (remaining), TD-15</w:t>
             </w:r>
           </w:p>
         </w:tc>
@@ -17029,7 +17135,7 @@
               <w:jc w:val="right"/>
             </w:pPr>
             <w:r>
-              <w:t xml:space="preserve">101 h</w:t>
+              <w:t xml:space="preserve">100 h</w:t>
             </w:r>
           </w:p>
         </w:tc>
@@ -17043,6 +17149,64 @@
             <w:r>
               <w:t xml:space="preserve">Real settlement with webhook reconciliation; real SMS/e-mail; real consultation media; data-processing agreement executed</w:t>
             </w:r>
+          </w:p>
+        </w:tc>
+      </w:tr>
+      <w:tr>
+        <w:tc>
+          <w:tcPr/>
+          <w:p>
+            <w:pPr>
+              <w:pStyle w:val="Compact"/>
+            </w:pPr>
+          </w:p>
+        </w:tc>
+        <w:tc>
+          <w:tcPr/>
+          <w:p>
+            <w:pPr>
+              <w:pStyle w:val="Compact"/>
+            </w:pPr>
+          </w:p>
+        </w:tc>
+        <w:tc>
+          <w:tcPr/>
+          <w:p>
+            <w:pPr>
+              <w:pStyle w:val="Compact"/>
+              <w:jc w:val="left"/>
+            </w:pPr>
+            <w:r>
+              <w:rPr>
+                <w:b/>
+                <w:bCs/>
+              </w:rPr>
+              <w:t xml:space="preserve">Total</w:t>
+            </w:r>
+          </w:p>
+        </w:tc>
+        <w:tc>
+          <w:tcPr/>
+          <w:p>
+            <w:pPr>
+              <w:pStyle w:val="Compact"/>
+              <w:jc w:val="right"/>
+            </w:pPr>
+            <w:r>
+              <w:rPr>
+                <w:b/>
+                <w:bCs/>
+              </w:rPr>
+              <w:t xml:space="preserve">246 h</w:t>
+            </w:r>
+          </w:p>
+        </w:tc>
+        <w:tc>
+          <w:tcPr/>
+          <w:p>
+            <w:pPr>
+              <w:pStyle w:val="Compact"/>
+            </w:pPr>
           </w:p>
         </w:tc>
       </w:tr>

</xml_diff>